<commit_message>
Actualización de documentación y cambios aprobados
</commit_message>
<xml_diff>
--- a/Fase 1/Evidencias Proyecto/SegurIA-LPR_Análisis_del_Caso.docx
+++ b/Fase 1/Evidencias Proyecto/SegurIA-LPR_Análisis_del_Caso.docx
@@ -21,31 +21,8 @@
           <w:szCs w:val="72"/>
         </w:rPr>
         <w:t>Análisis del Caso</w:t>
-      </w:r>
-      <w:r>
-        <w:rPr>
-          <w:color w:val="2F5496"/>
-          <w:sz w:val="72"/>
-          <w:szCs w:val="72"/>
-        </w:rPr>
         <w:br/>
-        <w:t>“</w:t>
-      </w:r>
-      <w:r>
-        <w:rPr>
-          <w:color w:val="2F5496"/>
-          <w:sz w:val="72"/>
-          <w:szCs w:val="72"/>
-        </w:rPr>
-        <w:t>SegurIA-LPR</w:t>
-      </w:r>
-      <w:r>
-        <w:rPr>
-          <w:color w:val="2F5496"/>
-          <w:sz w:val="72"/>
-          <w:szCs w:val="72"/>
-        </w:rPr>
-        <w:t>”</w:t>
+        <w:t>“SegurIA-LPR”</w:t>
       </w:r>
     </w:p>
     <w:p>
@@ -86,39 +63,7 @@
           <w:sz w:val="24"/>
           <w:szCs w:val="24"/>
         </w:rPr>
-        <w:t xml:space="preserve">Documento, desarrollo </w:t>
-      </w:r>
-      <w:r>
-        <w:rPr>
-          <w:color w:val="000000"/>
-          <w:sz w:val="24"/>
-          <w:szCs w:val="24"/>
-        </w:rPr>
-        <w:t>Análisis del caso</w:t>
-      </w:r>
-      <w:r>
-        <w:rPr>
-          <w:color w:val="000000"/>
-          <w:sz w:val="24"/>
-          <w:szCs w:val="24"/>
-        </w:rPr>
-        <w:t xml:space="preserve"> “</w:t>
-      </w:r>
-      <w:r>
-        <w:rPr>
-          <w:color w:val="000000"/>
-          <w:sz w:val="24"/>
-          <w:szCs w:val="24"/>
-        </w:rPr>
-        <w:t>SegurIA-LPR</w:t>
-      </w:r>
-      <w:r>
-        <w:rPr>
-          <w:color w:val="000000"/>
-          <w:sz w:val="24"/>
-          <w:szCs w:val="24"/>
-        </w:rPr>
-        <w:t>”.</w:t>
+        <w:t xml:space="preserve">Documento, desarrollo Análisis del caso “SegurIA-LPR”.</w:t>
       </w:r>
     </w:p>
     <w:p/>
@@ -157,13 +102,7 @@
             <w:rPr>
               <w:lang w:val="es-ES"/>
             </w:rPr>
-            <w:t>Í</w:t>
-          </w:r>
-          <w:r>
-            <w:rPr>
-              <w:lang w:val="es-ES"/>
-            </w:rPr>
-            <w:t>ndice</w:t>
+            <w:t>Índice</w:t>
           </w:r>
         </w:p>
         <w:p>
@@ -183,11 +122,7 @@
           </w:pPr>
           <w:r>
             <w:fldChar w:fldCharType="begin"/>
-          </w:r>
-          <w:r>
             <w:instrText xml:space="preserve"> TOC \o "1-3" \h \z \u </w:instrText>
-          </w:r>
-          <w:r>
             <w:fldChar w:fldCharType="separate"/>
           </w:r>
           <w:hyperlink w:anchor="_Toc241363071" w:history="1">
@@ -208,46 +143,10 @@
                 <w:webHidden/>
               </w:rPr>
               <w:tab/>
-            </w:r>
-            <w:r>
-              <w:rPr>
-                <w:noProof/>
-                <w:webHidden/>
-              </w:rPr>
               <w:fldChar w:fldCharType="begin"/>
-            </w:r>
-            <w:r>
-              <w:rPr>
-                <w:noProof/>
-                <w:webHidden/>
-              </w:rPr>
               <w:instrText xml:space="preserve"> PAGEREF _Toc241363071 \h </w:instrText>
-            </w:r>
-            <w:r>
-              <w:rPr>
-                <w:noProof/>
-                <w:webHidden/>
-              </w:rPr>
-            </w:r>
-            <w:r>
-              <w:rPr>
-                <w:noProof/>
-                <w:webHidden/>
-              </w:rPr>
               <w:fldChar w:fldCharType="separate"/>
-            </w:r>
-            <w:r>
-              <w:rPr>
-                <w:noProof/>
-                <w:webHidden/>
-              </w:rPr>
               <w:t>3</w:t>
-            </w:r>
-            <w:r>
-              <w:rPr>
-                <w:noProof/>
-                <w:webHidden/>
-              </w:rPr>
               <w:fldChar w:fldCharType="end"/>
             </w:r>
           </w:hyperlink>
@@ -285,46 +184,10 @@
                 <w:webHidden/>
               </w:rPr>
               <w:tab/>
-            </w:r>
-            <w:r>
-              <w:rPr>
-                <w:noProof/>
-                <w:webHidden/>
-              </w:rPr>
               <w:fldChar w:fldCharType="begin"/>
-            </w:r>
-            <w:r>
-              <w:rPr>
-                <w:noProof/>
-                <w:webHidden/>
-              </w:rPr>
               <w:instrText xml:space="preserve"> PAGEREF _Toc241363072 \h </w:instrText>
-            </w:r>
-            <w:r>
-              <w:rPr>
-                <w:noProof/>
-                <w:webHidden/>
-              </w:rPr>
-            </w:r>
-            <w:r>
-              <w:rPr>
-                <w:noProof/>
-                <w:webHidden/>
-              </w:rPr>
               <w:fldChar w:fldCharType="separate"/>
-            </w:r>
-            <w:r>
-              <w:rPr>
-                <w:noProof/>
-                <w:webHidden/>
-              </w:rPr>
               <w:t>3</w:t>
-            </w:r>
-            <w:r>
-              <w:rPr>
-                <w:noProof/>
-                <w:webHidden/>
-              </w:rPr>
               <w:fldChar w:fldCharType="end"/>
             </w:r>
           </w:hyperlink>
@@ -360,46 +223,10 @@
                 <w:webHidden/>
               </w:rPr>
               <w:tab/>
-            </w:r>
-            <w:r>
-              <w:rPr>
-                <w:noProof/>
-                <w:webHidden/>
-              </w:rPr>
               <w:fldChar w:fldCharType="begin"/>
-            </w:r>
-            <w:r>
-              <w:rPr>
-                <w:noProof/>
-                <w:webHidden/>
-              </w:rPr>
               <w:instrText xml:space="preserve"> PAGEREF _Toc241363073 \h </w:instrText>
-            </w:r>
-            <w:r>
-              <w:rPr>
-                <w:noProof/>
-                <w:webHidden/>
-              </w:rPr>
-            </w:r>
-            <w:r>
-              <w:rPr>
-                <w:noProof/>
-                <w:webHidden/>
-              </w:rPr>
               <w:fldChar w:fldCharType="separate"/>
-            </w:r>
-            <w:r>
-              <w:rPr>
-                <w:noProof/>
-                <w:webHidden/>
-              </w:rPr>
               <w:t>3</w:t>
-            </w:r>
-            <w:r>
-              <w:rPr>
-                <w:noProof/>
-                <w:webHidden/>
-              </w:rPr>
               <w:fldChar w:fldCharType="end"/>
             </w:r>
           </w:hyperlink>
@@ -435,46 +262,10 @@
                 <w:webHidden/>
               </w:rPr>
               <w:tab/>
-            </w:r>
-            <w:r>
-              <w:rPr>
-                <w:noProof/>
-                <w:webHidden/>
-              </w:rPr>
               <w:fldChar w:fldCharType="begin"/>
-            </w:r>
-            <w:r>
-              <w:rPr>
-                <w:noProof/>
-                <w:webHidden/>
-              </w:rPr>
               <w:instrText xml:space="preserve"> PAGEREF _Toc241363074 \h </w:instrText>
-            </w:r>
-            <w:r>
-              <w:rPr>
-                <w:noProof/>
-                <w:webHidden/>
-              </w:rPr>
-            </w:r>
-            <w:r>
-              <w:rPr>
-                <w:noProof/>
-                <w:webHidden/>
-              </w:rPr>
               <w:fldChar w:fldCharType="separate"/>
-            </w:r>
-            <w:r>
-              <w:rPr>
-                <w:noProof/>
-                <w:webHidden/>
-              </w:rPr>
               <w:t>3</w:t>
-            </w:r>
-            <w:r>
-              <w:rPr>
-                <w:noProof/>
-                <w:webHidden/>
-              </w:rPr>
               <w:fldChar w:fldCharType="end"/>
             </w:r>
           </w:hyperlink>
@@ -512,46 +303,10 @@
                 <w:webHidden/>
               </w:rPr>
               <w:tab/>
-            </w:r>
-            <w:r>
-              <w:rPr>
-                <w:noProof/>
-                <w:webHidden/>
-              </w:rPr>
               <w:fldChar w:fldCharType="begin"/>
-            </w:r>
-            <w:r>
-              <w:rPr>
-                <w:noProof/>
-                <w:webHidden/>
-              </w:rPr>
               <w:instrText xml:space="preserve"> PAGEREF _Toc241363075 \h </w:instrText>
-            </w:r>
-            <w:r>
-              <w:rPr>
-                <w:noProof/>
-                <w:webHidden/>
-              </w:rPr>
-            </w:r>
-            <w:r>
-              <w:rPr>
-                <w:noProof/>
-                <w:webHidden/>
-              </w:rPr>
               <w:fldChar w:fldCharType="separate"/>
-            </w:r>
-            <w:r>
-              <w:rPr>
-                <w:noProof/>
-                <w:webHidden/>
-              </w:rPr>
               <w:t>3</w:t>
-            </w:r>
-            <w:r>
-              <w:rPr>
-                <w:noProof/>
-                <w:webHidden/>
-              </w:rPr>
               <w:fldChar w:fldCharType="end"/>
             </w:r>
           </w:hyperlink>
@@ -589,46 +344,10 @@
                 <w:webHidden/>
               </w:rPr>
               <w:tab/>
-            </w:r>
-            <w:r>
-              <w:rPr>
-                <w:noProof/>
-                <w:webHidden/>
-              </w:rPr>
               <w:fldChar w:fldCharType="begin"/>
-            </w:r>
-            <w:r>
-              <w:rPr>
-                <w:noProof/>
-                <w:webHidden/>
-              </w:rPr>
               <w:instrText xml:space="preserve"> PAGEREF _Toc241363076 \h </w:instrText>
-            </w:r>
-            <w:r>
-              <w:rPr>
-                <w:noProof/>
-                <w:webHidden/>
-              </w:rPr>
-            </w:r>
-            <w:r>
-              <w:rPr>
-                <w:noProof/>
-                <w:webHidden/>
-              </w:rPr>
               <w:fldChar w:fldCharType="separate"/>
-            </w:r>
-            <w:r>
-              <w:rPr>
-                <w:noProof/>
-                <w:webHidden/>
-              </w:rPr>
-              <w:t>4</w:t>
-            </w:r>
-            <w:r>
-              <w:rPr>
-                <w:noProof/>
-                <w:webHidden/>
-              </w:rPr>
+              <w:t>5</w:t>
               <w:fldChar w:fldCharType="end"/>
             </w:r>
           </w:hyperlink>
@@ -664,46 +383,10 @@
                 <w:webHidden/>
               </w:rPr>
               <w:tab/>
-            </w:r>
-            <w:r>
-              <w:rPr>
-                <w:noProof/>
-                <w:webHidden/>
-              </w:rPr>
               <w:fldChar w:fldCharType="begin"/>
-            </w:r>
-            <w:r>
-              <w:rPr>
-                <w:noProof/>
-                <w:webHidden/>
-              </w:rPr>
               <w:instrText xml:space="preserve"> PAGEREF _Toc241363077 \h </w:instrText>
-            </w:r>
-            <w:r>
-              <w:rPr>
-                <w:noProof/>
-                <w:webHidden/>
-              </w:rPr>
-            </w:r>
-            <w:r>
-              <w:rPr>
-                <w:noProof/>
-                <w:webHidden/>
-              </w:rPr>
               <w:fldChar w:fldCharType="separate"/>
-            </w:r>
-            <w:r>
-              <w:rPr>
-                <w:noProof/>
-                <w:webHidden/>
-              </w:rPr>
-              <w:t>4</w:t>
-            </w:r>
-            <w:r>
-              <w:rPr>
-                <w:noProof/>
-                <w:webHidden/>
-              </w:rPr>
+              <w:t>5</w:t>
               <w:fldChar w:fldCharType="end"/>
             </w:r>
           </w:hyperlink>
@@ -739,46 +422,10 @@
                 <w:webHidden/>
               </w:rPr>
               <w:tab/>
-            </w:r>
-            <w:r>
-              <w:rPr>
-                <w:noProof/>
-                <w:webHidden/>
-              </w:rPr>
               <w:fldChar w:fldCharType="begin"/>
-            </w:r>
-            <w:r>
-              <w:rPr>
-                <w:noProof/>
-                <w:webHidden/>
-              </w:rPr>
               <w:instrText xml:space="preserve"> PAGEREF _Toc241363078 \h </w:instrText>
-            </w:r>
-            <w:r>
-              <w:rPr>
-                <w:noProof/>
-                <w:webHidden/>
-              </w:rPr>
-            </w:r>
-            <w:r>
-              <w:rPr>
-                <w:noProof/>
-                <w:webHidden/>
-              </w:rPr>
               <w:fldChar w:fldCharType="separate"/>
-            </w:r>
-            <w:r>
-              <w:rPr>
-                <w:noProof/>
-                <w:webHidden/>
-              </w:rPr>
-              <w:t>4</w:t>
-            </w:r>
-            <w:r>
-              <w:rPr>
-                <w:noProof/>
-                <w:webHidden/>
-              </w:rPr>
+              <w:t>5</w:t>
               <w:fldChar w:fldCharType="end"/>
             </w:r>
           </w:hyperlink>
@@ -816,46 +463,10 @@
                 <w:webHidden/>
               </w:rPr>
               <w:tab/>
-            </w:r>
-            <w:r>
-              <w:rPr>
-                <w:noProof/>
-                <w:webHidden/>
-              </w:rPr>
               <w:fldChar w:fldCharType="begin"/>
-            </w:r>
-            <w:r>
-              <w:rPr>
-                <w:noProof/>
-                <w:webHidden/>
-              </w:rPr>
               <w:instrText xml:space="preserve"> PAGEREF _Toc241363079 \h </w:instrText>
-            </w:r>
-            <w:r>
-              <w:rPr>
-                <w:noProof/>
-                <w:webHidden/>
-              </w:rPr>
-            </w:r>
-            <w:r>
-              <w:rPr>
-                <w:noProof/>
-                <w:webHidden/>
-              </w:rPr>
               <w:fldChar w:fldCharType="separate"/>
-            </w:r>
-            <w:r>
-              <w:rPr>
-                <w:noProof/>
-                <w:webHidden/>
-              </w:rPr>
-              <w:t>5</w:t>
-            </w:r>
-            <w:r>
-              <w:rPr>
-                <w:noProof/>
-                <w:webHidden/>
-              </w:rPr>
+              <w:t>6</w:t>
               <w:fldChar w:fldCharType="end"/>
             </w:r>
           </w:hyperlink>
@@ -891,46 +502,10 @@
                 <w:webHidden/>
               </w:rPr>
               <w:tab/>
-            </w:r>
-            <w:r>
-              <w:rPr>
-                <w:noProof/>
-                <w:webHidden/>
-              </w:rPr>
               <w:fldChar w:fldCharType="begin"/>
-            </w:r>
-            <w:r>
-              <w:rPr>
-                <w:noProof/>
-                <w:webHidden/>
-              </w:rPr>
               <w:instrText xml:space="preserve"> PAGEREF _Toc241363080 \h </w:instrText>
-            </w:r>
-            <w:r>
-              <w:rPr>
-                <w:noProof/>
-                <w:webHidden/>
-              </w:rPr>
-            </w:r>
-            <w:r>
-              <w:rPr>
-                <w:noProof/>
-                <w:webHidden/>
-              </w:rPr>
               <w:fldChar w:fldCharType="separate"/>
-            </w:r>
-            <w:r>
-              <w:rPr>
-                <w:noProof/>
-                <w:webHidden/>
-              </w:rPr>
-              <w:t>5</w:t>
-            </w:r>
-            <w:r>
-              <w:rPr>
-                <w:noProof/>
-                <w:webHidden/>
-              </w:rPr>
+              <w:t>6</w:t>
               <w:fldChar w:fldCharType="end"/>
             </w:r>
           </w:hyperlink>
@@ -966,46 +541,10 @@
                 <w:webHidden/>
               </w:rPr>
               <w:tab/>
-            </w:r>
-            <w:r>
-              <w:rPr>
-                <w:noProof/>
-                <w:webHidden/>
-              </w:rPr>
               <w:fldChar w:fldCharType="begin"/>
-            </w:r>
-            <w:r>
-              <w:rPr>
-                <w:noProof/>
-                <w:webHidden/>
-              </w:rPr>
               <w:instrText xml:space="preserve"> PAGEREF _Toc241363081 \h </w:instrText>
-            </w:r>
-            <w:r>
-              <w:rPr>
-                <w:noProof/>
-                <w:webHidden/>
-              </w:rPr>
-            </w:r>
-            <w:r>
-              <w:rPr>
-                <w:noProof/>
-                <w:webHidden/>
-              </w:rPr>
               <w:fldChar w:fldCharType="separate"/>
-            </w:r>
-            <w:r>
-              <w:rPr>
-                <w:noProof/>
-                <w:webHidden/>
-              </w:rPr>
-              <w:t>5</w:t>
-            </w:r>
-            <w:r>
-              <w:rPr>
-                <w:noProof/>
-                <w:webHidden/>
-              </w:rPr>
+              <w:t>6</w:t>
               <w:fldChar w:fldCharType="end"/>
             </w:r>
           </w:hyperlink>
@@ -1043,46 +582,10 @@
                 <w:webHidden/>
               </w:rPr>
               <w:tab/>
-            </w:r>
-            <w:r>
-              <w:rPr>
-                <w:noProof/>
-                <w:webHidden/>
-              </w:rPr>
               <w:fldChar w:fldCharType="begin"/>
-            </w:r>
-            <w:r>
-              <w:rPr>
-                <w:noProof/>
-                <w:webHidden/>
-              </w:rPr>
               <w:instrText xml:space="preserve"> PAGEREF _Toc241363082 \h </w:instrText>
-            </w:r>
-            <w:r>
-              <w:rPr>
-                <w:noProof/>
-                <w:webHidden/>
-              </w:rPr>
-            </w:r>
-            <w:r>
-              <w:rPr>
-                <w:noProof/>
-                <w:webHidden/>
-              </w:rPr>
               <w:fldChar w:fldCharType="separate"/>
-            </w:r>
-            <w:r>
-              <w:rPr>
-                <w:noProof/>
-                <w:webHidden/>
-              </w:rPr>
-              <w:t>5</w:t>
-            </w:r>
-            <w:r>
-              <w:rPr>
-                <w:noProof/>
-                <w:webHidden/>
-              </w:rPr>
+              <w:t>6</w:t>
               <w:fldChar w:fldCharType="end"/>
             </w:r>
           </w:hyperlink>
@@ -1118,46 +621,10 @@
                 <w:webHidden/>
               </w:rPr>
               <w:tab/>
-            </w:r>
-            <w:r>
-              <w:rPr>
-                <w:noProof/>
-                <w:webHidden/>
-              </w:rPr>
               <w:fldChar w:fldCharType="begin"/>
-            </w:r>
-            <w:r>
-              <w:rPr>
-                <w:noProof/>
-                <w:webHidden/>
-              </w:rPr>
               <w:instrText xml:space="preserve"> PAGEREF _Toc241363083 \h </w:instrText>
-            </w:r>
-            <w:r>
-              <w:rPr>
-                <w:noProof/>
-                <w:webHidden/>
-              </w:rPr>
-            </w:r>
-            <w:r>
-              <w:rPr>
-                <w:noProof/>
-                <w:webHidden/>
-              </w:rPr>
               <w:fldChar w:fldCharType="separate"/>
-            </w:r>
-            <w:r>
-              <w:rPr>
-                <w:noProof/>
-                <w:webHidden/>
-              </w:rPr>
-              <w:t>5</w:t>
-            </w:r>
-            <w:r>
-              <w:rPr>
-                <w:noProof/>
-                <w:webHidden/>
-              </w:rPr>
+              <w:t>6</w:t>
               <w:fldChar w:fldCharType="end"/>
             </w:r>
           </w:hyperlink>
@@ -1193,46 +660,49 @@
                 <w:webHidden/>
               </w:rPr>
               <w:tab/>
+              <w:fldChar w:fldCharType="begin"/>
+              <w:instrText xml:space="preserve"> PAGEREF _Toc241363084 \h </w:instrText>
+              <w:fldChar w:fldCharType="separate"/>
+              <w:t>7</w:t>
+              <w:fldChar w:fldCharType="end"/>
+            </w:r>
+          </w:hyperlink>
+        </w:p>
+        <w:p>
+          <w:pPr>
+            <w:pStyle w:val="TDC3"/>
+            <w:tabs>
+              <w:tab w:val="right" w:leader="dot" w:pos="8828"/>
+            </w:tabs>
+            <w:rPr>
+              <w:rFonts w:asciiTheme="minorHAnsi" w:eastAsiaTheme="minorEastAsia" w:hAnsiTheme="minorHAnsi" w:cstheme="minorBidi"/>
+              <w:noProof/>
+              <w:kern w:val="2"/>
+              <w:sz w:val="24"/>
+              <w:szCs w:val="24"/>
+              <w14:ligatures w14:val="standardContextual"/>
+            </w:rPr>
+          </w:pPr>
+          <w:hyperlink w:anchor="_Toc241363099" w:history="1">
+            <w:r>
+              <w:rPr>
+                <w:rStyle w:val="Hipervnculo"/>
+                <w:i/>
+                <w:iCs/>
+                <w:noProof/>
+              </w:rPr>
+              <w:t>Riesgos</w:t>
             </w:r>
             <w:r>
               <w:rPr>
                 <w:noProof/>
                 <w:webHidden/>
               </w:rPr>
+              <w:tab/>
               <w:fldChar w:fldCharType="begin"/>
-            </w:r>
-            <w:r>
-              <w:rPr>
-                <w:noProof/>
-                <w:webHidden/>
-              </w:rPr>
-              <w:instrText xml:space="preserve"> PAGEREF _Toc241363084 \h </w:instrText>
-            </w:r>
-            <w:r>
-              <w:rPr>
-                <w:noProof/>
-                <w:webHidden/>
-              </w:rPr>
-            </w:r>
-            <w:r>
-              <w:rPr>
-                <w:noProof/>
-                <w:webHidden/>
-              </w:rPr>
+              <w:instrText xml:space="preserve"> PAGEREF _Toc241363099 \h </w:instrText>
               <w:fldChar w:fldCharType="separate"/>
-            </w:r>
-            <w:r>
-              <w:rPr>
-                <w:noProof/>
-                <w:webHidden/>
-              </w:rPr>
-              <w:t>5</w:t>
-            </w:r>
-            <w:r>
-              <w:rPr>
-                <w:noProof/>
-                <w:webHidden/>
-              </w:rPr>
+              <w:t>7</w:t>
               <w:fldChar w:fldCharType="end"/>
             </w:r>
           </w:hyperlink>
@@ -1396,7 +866,7 @@
           </w:tcPr>
           <w:p>
             <w:r>
-              <w:t>1.0</w:t>
+              <w:t xml:space="preserve">1.1</w:t>
             </w:r>
           </w:p>
         </w:tc>
@@ -1442,8 +912,77 @@
           <w:sz w:val="32"/>
           <w:szCs w:val="32"/>
         </w:rPr>
-        <w:t>D</w:t>
-      </w:r>
+        <w:t>Definición del Problema y Necesidad</w:t>
+      </w:r>
+      <w:bookmarkEnd w:id="1"/>
+    </w:p>
+    <w:p>
+      <w:pPr>
+        <w:pStyle w:val="Ttulo3"/>
+        <w:rPr>
+          <w:i/>
+          <w:iCs/>
+        </w:rPr>
+      </w:pPr>
+      <w:bookmarkStart w:id="2" w:name="_Toc241363073"/>
+      <w:r>
+        <w:rPr>
+          <w:i/>
+          <w:iCs/>
+        </w:rPr>
+        <w:t>Problema</w:t>
+      </w:r>
+      <w:bookmarkEnd w:id="2"/>
+    </w:p>
+    <w:p>
+      <w:r>
+        <w:t>El control de acceso vehicular en condominios y edificios habitacionales en Chile se realiza predominantemente mediante controles remotos inalámbricos o verificación manual por parte de guardias de seguridad. Ambos métodos presentan fallas estructurales de seguridad: el acceso no se valida contra un registro objetivo de autorización, sino que depende de la posesión de un dispositivo físico o del criterio del personal. Esto genera vulnerabilidades ante pérdida, robo, préstamo no autorizado de controles o error humano en la verificación. Esta problemática afecta a residentes a nivel nacional debido al crecimiento sostenido del modelo habitacional en condominios.</w:t>
+      </w:r>
+    </w:p>
+    <w:p>
+      <w:pPr>
+        <w:pStyle w:val="Ttulo3"/>
+        <w:rPr>
+          <w:i/>
+          <w:iCs/>
+        </w:rPr>
+      </w:pPr>
+      <w:bookmarkStart w:id="3" w:name="_Toc241363074"/>
+      <w:r>
+        <w:rPr>
+          <w:i/>
+          <w:iCs/>
+        </w:rPr>
+        <w:t>Necesidad</w:t>
+      </w:r>
+      <w:bookmarkEnd w:id="3"/>
+    </w:p>
+    <w:p>
+      <w:r>
+        <w:t>Existe la necesidad de un sistema de validación de acceso vehicular automatizado y objetivo, que funcione independientemente de dispositivos físicos o del criterio manual. Para ser accesible a comunidades con recursos limitados y no solo a proyectos de alto presupuesto, la solución debe implementarse sobre hardware de bajo costo.</w:t>
+      </w:r>
+    </w:p>
+    <w:p>
+      <w:pPr>
+        <w:pStyle w:val="Ttulo2"/>
+        <w:pBdr>
+          <w:bottom w:val="single" w:sz="4" w:space="1" w:color="000000"/>
+        </w:pBdr>
+        <w:spacing w:after="240"/>
+      </w:pPr>
+      <w:r>
+        <w:rPr>
+          <w:b/>
+          <w:bCs/>
+          <w:i/>
+          <w:iCs/>
+          <w:color w:val="000000"/>
+          <w:sz w:val="24"/>
+          <w:szCs w:val="24"/>
+        </w:rPr>
+        <w:br/>
+      </w:r>
+      <w:bookmarkStart w:id="4" w:name="_Toc241363075"/>
       <w:r>
         <w:rPr>
           <w:b/>
@@ -1454,54 +993,78 @@
           <w:sz w:val="32"/>
           <w:szCs w:val="32"/>
         </w:rPr>
-        <w:t>efinición del Problema y Necesidad</w:t>
-      </w:r>
-      <w:bookmarkEnd w:id="1"/>
-    </w:p>
-    <w:p>
-      <w:pPr>
-        <w:pStyle w:val="Ttulo3"/>
-        <w:rPr>
-          <w:i/>
-          <w:iCs/>
-        </w:rPr>
-      </w:pPr>
-      <w:bookmarkStart w:id="2" w:name="_Toc241363073"/>
-      <w:r>
-        <w:rPr>
-          <w:i/>
-          <w:iCs/>
-        </w:rPr>
-        <w:t>Problema</w:t>
-      </w:r>
-      <w:bookmarkEnd w:id="2"/>
-    </w:p>
-    <w:p>
-      <w:r>
-        <w:t>El control de acceso vehicular en condominios y edificios habitacionales en Chile se realiza predominantemente mediante controles remotos inalámbricos o verificación manual por parte de guardias de seguridad. Ambos métodos presentan fallas estructurales de seguridad: el acceso no se valida contra un registro objetivo de autorización, sino que depende de la posesión de un dispositivo físico o del criterio del personal. Esto genera vulnerabilidades ante pérdida, robo, préstamo no autorizado de controles o error humano en la verificación. Esta problemática afecta a residentes a nivel nacional debido al crecimiento sostenido del modelo habitacional en condominios.</w:t>
-      </w:r>
-    </w:p>
-    <w:p>
-      <w:pPr>
-        <w:pStyle w:val="Ttulo3"/>
-        <w:rPr>
-          <w:i/>
-          <w:iCs/>
-        </w:rPr>
-      </w:pPr>
-      <w:bookmarkStart w:id="3" w:name="_Toc241363074"/>
-      <w:r>
-        <w:rPr>
-          <w:i/>
-          <w:iCs/>
-        </w:rPr>
-        <w:t>Necesidad</w:t>
-      </w:r>
-      <w:bookmarkEnd w:id="3"/>
-    </w:p>
-    <w:p>
-      <w:r>
-        <w:t>Existe la necesidad de un sistema de validación de acceso vehicular automatizado y objetivo, que funcione independientemente de dispositivos físicos o del criterio manual. Para ser accesible a comunidades con recursos limitados y no solo a proyectos de alto presupuesto, la solución debe implementarse sobre hardware de bajo costo.</w:t>
+        <w:t>Propuesta de Solución y Aporte de Valor</w:t>
+      </w:r>
+      <w:bookmarkEnd w:id="4"/>
+    </w:p>
+    <w:p>
+      <w:r>
+        <w:t>SegurIA-LPR es una plataforma web multi-tenant de control de acceso vehicular basada en reconocimiento automático de patentes (LPR).</w:t>
+      </w:r>
+    </w:p>
+    <w:p>
+      <w:pPr>
+        <w:pStyle w:val="Prrafodelista"/>
+        <w:numPr>
+          <w:ilvl w:val="0"/>
+          <w:numId w:val="4"/>
+        </w:numPr>
+      </w:pPr>
+      <w:r>
+        <w:t xml:space="preserve">Validación Automatizada: La patente capturada por una cámara IP se procesa en una Raspberry Pi y se valida automáticamente contra una copia local de los vehículos autorizados del recinto, sincronizada con el backend.</w:t>
+      </w:r>
+    </w:p>
+    <w:p>
+      <w:pPr>
+        <w:pStyle w:val="Prrafodelista"/>
+        <w:numPr>
+          <w:ilvl w:val="0"/>
+          <w:numId w:val="4"/>
+        </w:numPr>
+      </w:pPr>
+      <w:r>
+        <w:t xml:space="preserve">Gestión Autónoma de Vehículos y Visitas: El residente (Propietario) registra sus propios vehículos y los vehículos de sus visitas, estos últimos con una vigencia acotada a 24 horas. Los cambios quedan registrados en la auditoría para su revisión por el Administrador de recinto.</w:t>
+      </w:r>
+    </w:p>
+    <w:p>
+      <w:pPr>
+        <w:pStyle w:val="Prrafodelista"/>
+        <w:numPr>
+          <w:ilvl w:val="0"/>
+          <w:numId w:val="4"/>
+        </w:numPr>
+      </w:pPr>
+      <w:r>
+        <w:t xml:space="preserve">Hardware de Bajo Costo: Utiliza una cámara IP TP-Link Tapo C310 y una Raspberry Pi 4 como unidad de procesamiento de borde (edge), evitando cámaras LPR comerciales especializadas de alto costo.</w:t>
+      </w:r>
+    </w:p>
+    <w:p>
+      <w:pPr>
+        <w:pStyle w:val="Prrafodelista"/>
+        <w:numPr>
+          <w:ilvl w:val="0"/>
+          <w:numId w:val="4"/>
+        </w:numPr>
+      </w:pPr>
+      <w:r>
+        <w:t xml:space="preserve">Alertas en Tiempo Real: Genera alertas instantáneas (vía Socket.io) para el Guardia, junto con la imagen capturada, cuando un vehículo no reconocido intenta ingresar.</w:t>
+      </w:r>
+    </w:p>
+    <w:p>
+      <w:pPr>
+        <w:pStyle w:val="Prrafodelista"/>
+        <w:numPr>
+          <w:ilvl w:val="0"/>
+          <w:numId w:val="4"/>
+        </w:numPr>
+      </w:pPr>
+      <w:r>
+        <w:t xml:space="preserve">Plataforma en la Nube: El servicio web (Node.js, Express.js y PostgreSQL) se aloja en Render, el frontend en Netlify y las imágenes en Cloudinary, lo que permite operar el sistema sin infraestructura propia en el recinto.</w:t>
+      </w:r>
+    </w:p>
+    <w:p>
+      <w:r>
+        <w:br w:type="page"/>
       </w:r>
     </w:p>
     <w:p>
@@ -1522,9 +1085,10 @@
           <w:sz w:val="24"/>
           <w:szCs w:val="24"/>
         </w:rPr>
+        <w:lastRenderedPageBreak/>
         <w:br/>
       </w:r>
-      <w:bookmarkStart w:id="4" w:name="_Toc241363075"/>
+      <w:bookmarkStart w:id="5" w:name="_Toc241363076"/>
       <w:r>
         <w:rPr>
           <w:b/>
@@ -1535,66 +1099,157 @@
           <w:sz w:val="32"/>
           <w:szCs w:val="32"/>
         </w:rPr>
-        <w:t>Propuesta de Solución y Aporte de Valor</w:t>
-      </w:r>
-      <w:bookmarkEnd w:id="4"/>
-    </w:p>
-    <w:p>
-      <w:r>
-        <w:t>SegurIA-LPR es una plataforma web multi-tenant de control de acceso vehicular basada en reconocimiento automático de patentes (LPR).</w:t>
-      </w:r>
-    </w:p>
-    <w:p>
-      <w:pPr>
-        <w:pStyle w:val="Prrafodelista"/>
-        <w:numPr>
-          <w:ilvl w:val="0"/>
-          <w:numId w:val="4"/>
-        </w:numPr>
-      </w:pPr>
-      <w:r>
-        <w:t>Validación Automatizada: La patente capturada por una cámara IP se procesa y valida automáticamente contra la base de datos de patentes autorizadas por recinto.</w:t>
-      </w:r>
-    </w:p>
-    <w:p>
-      <w:pPr>
-        <w:pStyle w:val="Prrafodelista"/>
-        <w:numPr>
-          <w:ilvl w:val="0"/>
-          <w:numId w:val="4"/>
-        </w:numPr>
-      </w:pPr>
-      <w:r>
-        <w:t>Gestión Autónoma de Visitas: El residente (Propietario) registra vehículos de visita con una vigencia acotada a 24 horas.</w:t>
-      </w:r>
-    </w:p>
-    <w:p>
-      <w:pPr>
-        <w:pStyle w:val="Prrafodelista"/>
-        <w:numPr>
-          <w:ilvl w:val="0"/>
-          <w:numId w:val="4"/>
-        </w:numPr>
-      </w:pPr>
-      <w:r>
-        <w:t>Hardware de Bajo Costo: Utiliza una cámara IP TP-Link Tapo C310 y una Raspberry Pi 4 como unidad de procesamiento de borde (edge), evitando cámaras LPR comerciales especializadas de alto costo.</w:t>
-      </w:r>
-    </w:p>
-    <w:p>
-      <w:pPr>
-        <w:pStyle w:val="Prrafodelista"/>
-        <w:numPr>
-          <w:ilvl w:val="0"/>
-          <w:numId w:val="4"/>
-        </w:numPr>
-      </w:pPr>
-      <w:r>
-        <w:t>Alertas en Tiempo Real: Envía notificaciones instantáneas (vía WebSocket) al Guardia cuando un vehículo no reconocido intenta ingresar.</w:t>
-      </w:r>
-    </w:p>
-    <w:p>
-      <w:r>
-        <w:br w:type="page"/>
+        <w:t>Objetivos del Proyecto</w:t>
+      </w:r>
+      <w:bookmarkEnd w:id="5"/>
+    </w:p>
+    <w:p>
+      <w:pPr>
+        <w:pStyle w:val="Ttulo3"/>
+        <w:rPr>
+          <w:i/>
+          <w:iCs/>
+        </w:rPr>
+      </w:pPr>
+      <w:bookmarkStart w:id="6" w:name="_Toc241363077"/>
+      <w:r>
+        <w:rPr>
+          <w:i/>
+          <w:iCs/>
+        </w:rPr>
+        <w:t>Objetivo General</w:t>
+      </w:r>
+      <w:bookmarkEnd w:id="6"/>
+    </w:p>
+    <w:p>
+      <w:r>
+        <w:t>Desarrollar un sistema de control de acceso vehicular basado en el reconocimiento automático de patentes, utilizando hardware de bajo costo, con el fin de ser accesible para cualquier condominio o edificio y de mejorar la seguridad del ingreso vehicular.</w:t>
+      </w:r>
+    </w:p>
+    <w:p>
+      <w:pPr>
+        <w:pStyle w:val="Ttulo3"/>
+        <w:rPr>
+          <w:i/>
+          <w:iCs/>
+        </w:rPr>
+      </w:pPr>
+      <w:bookmarkStart w:id="7" w:name="_Toc241363078"/>
+      <w:r>
+        <w:rPr>
+          <w:i/>
+          <w:iCs/>
+        </w:rPr>
+        <w:t>Objetivos Específicos</w:t>
+      </w:r>
+      <w:bookmarkEnd w:id="7"/>
+    </w:p>
+    <w:p>
+      <w:pPr>
+        <w:pStyle w:val="Prrafodelista"/>
+        <w:numPr>
+          <w:ilvl w:val="0"/>
+          <w:numId w:val="4"/>
+        </w:numPr>
+      </w:pPr>
+      <w:r>
+        <w:t xml:space="preserve">OE01: Diseñar una arquitectura de solución que integre cámara IP, Raspberry Pi, procesamiento de visión artificial, backend en la nube, base de datos e interfaz web.</w:t>
+      </w:r>
+    </w:p>
+    <w:p>
+      <w:pPr>
+        <w:pStyle w:val="Prrafodelista"/>
+        <w:numPr>
+          <w:ilvl w:val="0"/>
+          <w:numId w:val="4"/>
+        </w:numPr>
+      </w:pPr>
+      <w:r>
+        <w:t xml:space="preserve">OE02: Diseñar e implementar un modelo de datos para administrar recintos, usuarios, vehículos, visitas, registros de acceso y alertas.</w:t>
+      </w:r>
+    </w:p>
+    <w:p>
+      <w:pPr>
+        <w:pStyle w:val="Prrafodelista"/>
+        <w:numPr>
+          <w:ilvl w:val="0"/>
+          <w:numId w:val="4"/>
+        </w:numPr>
+      </w:pPr>
+      <w:r>
+        <w:t xml:space="preserve">OE03: Preparar el entorno de procesamiento en Raspberry Pi 4, establecer la comunicación con la cámara Tapo C310 y mantener una copia local sincronizada de los vehículos autorizados.</w:t>
+      </w:r>
+    </w:p>
+    <w:p>
+      <w:pPr>
+        <w:pStyle w:val="Prrafodelista"/>
+        <w:numPr>
+          <w:ilvl w:val="0"/>
+          <w:numId w:val="4"/>
+        </w:numPr>
+      </w:pPr>
+      <w:r>
+        <w:t xml:space="preserve">OE04: Entrenar un modelo de Machine Learning para la detección de vehículos y patentes en imágenes capturadas por cámara.</w:t>
+      </w:r>
+    </w:p>
+    <w:p>
+      <w:pPr>
+        <w:pStyle w:val="Prrafodelista"/>
+        <w:numPr>
+          <w:ilvl w:val="0"/>
+          <w:numId w:val="4"/>
+        </w:numPr>
+      </w:pPr>
+      <w:r>
+        <w:t xml:space="preserve">OE05: Implementar un proceso de reconocimiento óptico de caracteres y validación de formato para la lectura de patentes.</w:t>
+      </w:r>
+    </w:p>
+    <w:p>
+      <w:pPr>
+        <w:pStyle w:val="Prrafodelista"/>
+        <w:numPr>
+          <w:ilvl w:val="0"/>
+          <w:numId w:val="4"/>
+        </w:numPr>
+      </w:pPr>
+      <w:r>
+        <w:t xml:space="preserve">OE06: Desarrollar una aplicación web con vistas diferenciadas para los roles Administrador (en sus niveles de plataforma y de recinto), Propietario y Guardia.</w:t>
+      </w:r>
+    </w:p>
+    <w:p>
+      <w:pPr>
+        <w:pStyle w:val="Prrafodelista"/>
+        <w:numPr>
+          <w:ilvl w:val="0"/>
+          <w:numId w:val="4"/>
+        </w:numPr>
+      </w:pPr>
+      <w:r>
+        <w:t xml:space="preserve">OE07: Implementar la gestión de vehículos autorizados y vehículos de visita con vigencia definida, notificando al Administrador de recinto los cambios realizados por los propietarios.</w:t>
+      </w:r>
+    </w:p>
+    <w:p>
+      <w:pPr>
+        <w:pStyle w:val="Prrafodelista"/>
+        <w:numPr>
+          <w:ilvl w:val="0"/>
+          <w:numId w:val="4"/>
+        </w:numPr>
+      </w:pPr>
+      <w:r>
+        <w:t xml:space="preserve">OE08: Implementar un sistema de alertas en tiempo real para notificar al Guardia ante vehículos no reconocidos.</w:t>
+      </w:r>
+    </w:p>
+    <w:p>
+      <w:pPr>
+        <w:pStyle w:val="Prrafodelista"/>
+        <w:numPr>
+          <w:ilvl w:val="0"/>
+          <w:numId w:val="4"/>
+        </w:numPr>
+      </w:pPr>
+      <w:r>
+        <w:t xml:space="preserve">OE09: Validar el funcionamiento del sistema mediante pruebas en terreno con vehículos autorizados.</w:t>
       </w:r>
     </w:p>
     <w:p>
@@ -1604,6 +1259,15 @@
           <w:bottom w:val="single" w:sz="4" w:space="1" w:color="000000"/>
         </w:pBdr>
         <w:spacing w:after="240"/>
+        <w:rPr>
+          <w:b/>
+          <w:bCs/>
+          <w:i/>
+          <w:iCs/>
+          <w:color w:val="000000"/>
+          <w:sz w:val="32"/>
+          <w:szCs w:val="32"/>
+        </w:rPr>
       </w:pPr>
       <w:r>
         <w:rPr>
@@ -1615,11 +1279,11 @@
           <w:sz w:val="24"/>
           <w:szCs w:val="24"/>
         </w:rPr>
-        <w:lastRenderedPageBreak/>
         <w:br/>
       </w:r>
-      <w:bookmarkStart w:id="5" w:name="_Toc241363076"/>
-      <w:r>
+    </w:p>
+    <w:p>
+      <w:pPr>
         <w:rPr>
           <w:b/>
           <w:bCs/>
@@ -1629,166 +1293,8 @@
           <w:sz w:val="32"/>
           <w:szCs w:val="32"/>
         </w:rPr>
-        <w:t>Objetivos del Proyecto</w:t>
-      </w:r>
-      <w:bookmarkEnd w:id="5"/>
-    </w:p>
-    <w:p>
-      <w:pPr>
-        <w:pStyle w:val="Ttulo3"/>
-        <w:rPr>
-          <w:i/>
-          <w:iCs/>
-        </w:rPr>
-      </w:pPr>
-      <w:bookmarkStart w:id="6" w:name="_Toc241363077"/>
-      <w:r>
-        <w:rPr>
-          <w:i/>
-          <w:iCs/>
-        </w:rPr>
-        <w:t>Objetivo General</w:t>
-      </w:r>
-      <w:bookmarkEnd w:id="6"/>
-    </w:p>
-    <w:p>
-      <w:r>
-        <w:t>Desarrollar un sistema de control de acceso vehicular basado en el reconocimiento automático de patentes, utilizando hardware de bajo costo, con el fin de ser accesible para cualquier condominio o edificio y de mejorar la seguridad del ingreso vehicular.</w:t>
-      </w:r>
-    </w:p>
-    <w:p>
-      <w:pPr>
-        <w:pStyle w:val="Ttulo3"/>
-        <w:rPr>
-          <w:i/>
-          <w:iCs/>
-        </w:rPr>
-      </w:pPr>
-      <w:bookmarkStart w:id="7" w:name="_Toc241363078"/>
-      <w:r>
-        <w:rPr>
-          <w:i/>
-          <w:iCs/>
-        </w:rPr>
-        <w:t>Objetivos Específicos</w:t>
-      </w:r>
-      <w:bookmarkEnd w:id="7"/>
-    </w:p>
-    <w:p>
-      <w:pPr>
-        <w:pStyle w:val="Prrafodelista"/>
-        <w:numPr>
-          <w:ilvl w:val="0"/>
-          <w:numId w:val="4"/>
-        </w:numPr>
-      </w:pPr>
-      <w:r>
-        <w:t>OE01: Diseñar una arquitectura de solución que integre cámara IP, Raspberry Pi, procesamiento de visión artificial, backend, base de datos e interfaz web.</w:t>
-      </w:r>
-    </w:p>
-    <w:p>
-      <w:pPr>
-        <w:pStyle w:val="Prrafodelista"/>
-        <w:numPr>
-          <w:ilvl w:val="0"/>
-          <w:numId w:val="4"/>
-        </w:numPr>
-      </w:pPr>
-      <w:r>
-        <w:t>OE02: Diseñar e implementar un modelo de datos para administrar recintos, usuarios, vehículos, visitas y registros de acceso.</w:t>
-      </w:r>
-    </w:p>
-    <w:p>
-      <w:pPr>
-        <w:pStyle w:val="Prrafodelista"/>
-        <w:numPr>
-          <w:ilvl w:val="0"/>
-          <w:numId w:val="4"/>
-        </w:numPr>
-      </w:pPr>
-      <w:r>
-        <w:t>OE03: Preparar el entorno de procesamiento en Raspberry Pi 4 y establecer la comunicación con la cámara Tapo C310 mediante mecanismos de transmisión compatibles.</w:t>
-      </w:r>
-    </w:p>
-    <w:p>
-      <w:pPr>
-        <w:pStyle w:val="Prrafodelista"/>
-        <w:numPr>
-          <w:ilvl w:val="0"/>
-          <w:numId w:val="4"/>
-        </w:numPr>
-      </w:pPr>
-      <w:r>
-        <w:t>OE04: Entrenar un modelo de Machine Learning para la detección de patentes vehiculares en imágenes capturadas por cámara.</w:t>
-      </w:r>
-    </w:p>
-    <w:p>
-      <w:pPr>
-        <w:pStyle w:val="Prrafodelista"/>
-        <w:numPr>
-          <w:ilvl w:val="0"/>
-          <w:numId w:val="4"/>
-        </w:numPr>
-      </w:pPr>
-      <w:r>
-        <w:t>OE05: Implementar un proceso de reconocimiento óptico de caracteres (OCR) y validación de formato para la lectura de patentes.</w:t>
-      </w:r>
-    </w:p>
-    <w:p>
-      <w:pPr>
-        <w:pStyle w:val="Prrafodelista"/>
-        <w:numPr>
-          <w:ilvl w:val="0"/>
-          <w:numId w:val="4"/>
-        </w:numPr>
-      </w:pPr>
-      <w:r>
-        <w:t>OE06: Desarrollar una aplicación web con vistas diferenciadas para los roles Administrador, Propietario y Guardia.</w:t>
-      </w:r>
-    </w:p>
-    <w:p>
-      <w:pPr>
-        <w:pStyle w:val="Prrafodelista"/>
-        <w:numPr>
-          <w:ilvl w:val="0"/>
-          <w:numId w:val="4"/>
-        </w:numPr>
-      </w:pPr>
-      <w:r>
-        <w:t>OE07: Implementar la gestión de vehículos autorizados y vehículos de visita con vigencia definida.</w:t>
-      </w:r>
-    </w:p>
-    <w:p>
-      <w:pPr>
-        <w:pStyle w:val="Prrafodelista"/>
-        <w:numPr>
-          <w:ilvl w:val="0"/>
-          <w:numId w:val="4"/>
-        </w:numPr>
-      </w:pPr>
-      <w:r>
-        <w:t>OE08: Implementar un sistema de alertas en tiempo real para notificar al Guardia ante vehículos no reconocidos.</w:t>
-      </w:r>
-    </w:p>
-    <w:p>
-      <w:pPr>
-        <w:pStyle w:val="Prrafodelista"/>
-        <w:numPr>
-          <w:ilvl w:val="0"/>
-          <w:numId w:val="4"/>
-        </w:numPr>
-      </w:pPr>
-      <w:r>
-        <w:t>OE09: Validar el funcionamiento del sistema mediante pruebas en terreno con vehículos autorizados.</w:t>
-      </w:r>
-    </w:p>
-    <w:p>
-      <w:pPr>
-        <w:pStyle w:val="Ttulo2"/>
-        <w:pBdr>
-          <w:bottom w:val="single" w:sz="4" w:space="1" w:color="000000"/>
-        </w:pBdr>
-        <w:spacing w:after="240"/>
+      </w:pPr>
+      <w:r>
         <w:rPr>
           <w:b/>
           <w:bCs/>
@@ -1798,6 +1304,268 @@
           <w:sz w:val="32"/>
           <w:szCs w:val="32"/>
         </w:rPr>
+        <w:br w:type="page"/>
+      </w:r>
+    </w:p>
+    <w:p>
+      <w:pPr>
+        <w:pStyle w:val="Ttulo2"/>
+        <w:pBdr>
+          <w:bottom w:val="single" w:sz="4" w:space="1" w:color="000000"/>
+        </w:pBdr>
+        <w:spacing w:after="240"/>
+      </w:pPr>
+      <w:bookmarkStart w:id="8" w:name="_Toc241363079"/>
+      <w:r>
+        <w:rPr>
+          <w:b/>
+          <w:bCs/>
+          <w:i/>
+          <w:iCs/>
+          <w:color w:val="000000"/>
+          <w:sz w:val="32"/>
+          <w:szCs w:val="32"/>
+        </w:rPr>
+        <w:lastRenderedPageBreak/>
+        <w:t>Alcance y Exclusiones</w:t>
+      </w:r>
+      <w:bookmarkEnd w:id="8"/>
+    </w:p>
+    <w:p>
+      <w:pPr>
+        <w:pStyle w:val="Ttulo3"/>
+        <w:rPr>
+          <w:i/>
+          <w:iCs/>
+        </w:rPr>
+      </w:pPr>
+      <w:bookmarkStart w:id="9" w:name="_Toc241363080"/>
+      <w:r>
+        <w:rPr>
+          <w:i/>
+          <w:iCs/>
+        </w:rPr>
+        <w:t>Dentro del Alcance (Inclusiones)</w:t>
+      </w:r>
+      <w:bookmarkEnd w:id="9"/>
+    </w:p>
+    <w:p>
+      <w:pPr>
+        <w:pStyle w:val="Prrafodelista"/>
+        <w:numPr>
+          <w:ilvl w:val="0"/>
+          <w:numId w:val="4"/>
+        </w:numPr>
+      </w:pPr>
+      <w:r>
+        <w:t xml:space="preserve">Arquitectura multi-tenant aislada por recinto (condominio/edificio).</w:t>
+      </w:r>
+    </w:p>
+    <w:p>
+      <w:pPr>
+        <w:pStyle w:val="Prrafodelista"/>
+        <w:numPr>
+          <w:ilvl w:val="0"/>
+          <w:numId w:val="4"/>
+        </w:numPr>
+      </w:pPr>
+      <w:r>
+        <w:t xml:space="preserve">Rol Administrador en dos niveles: Administrador SegurIA-LPR (creación de recintos y de sus administradores, y gestión de accesos) y Administrador de recinto (gestión de usuarios y vehículos autorizados de su recinto).</w:t>
+      </w:r>
+    </w:p>
+    <w:p>
+      <w:pPr>
+        <w:pStyle w:val="Prrafodelista"/>
+        <w:numPr>
+          <w:ilvl w:val="0"/>
+          <w:numId w:val="4"/>
+        </w:numPr>
+      </w:pPr>
+      <w:r>
+        <w:t xml:space="preserve">Registro de vehículos propios y de visitas por el Propietario, estas últimas con vigencia de 24 horas, con revisión de los cambios por el Administrador de recinto a partir de la auditoría.</w:t>
+      </w:r>
+    </w:p>
+    <w:p>
+      <w:pPr>
+        <w:pStyle w:val="Prrafodelista"/>
+        <w:numPr>
+          <w:ilvl w:val="0"/>
+          <w:numId w:val="4"/>
+        </w:numPr>
+      </w:pPr>
+      <w:r>
+        <w:t xml:space="preserve">Pipeline LPR en la Raspberry Pi: detección del vehículo y de la patente (YOLO fine-tuned), OCR y validación de formato chileno.</w:t>
+      </w:r>
+    </w:p>
+    <w:p>
+      <w:pPr>
+        <w:pStyle w:val="Prrafodelista"/>
+        <w:numPr>
+          <w:ilvl w:val="0"/>
+          <w:numId w:val="4"/>
+        </w:numPr>
+      </w:pPr>
+      <w:r>
+        <w:t xml:space="preserve">Validación contra una copia local sincronizada de los vehículos autorizados y alertas en tiempo real (Socket.io) para el Guardia, quien registra la gestión de cada alerta.</w:t>
+      </w:r>
+    </w:p>
+    <w:p>
+      <w:pPr>
+        <w:pStyle w:val="Prrafodelista"/>
+        <w:numPr>
+          <w:ilvl w:val="0"/>
+          <w:numId w:val="4"/>
+        </w:numPr>
+      </w:pPr>
+      <w:r>
+        <w:t xml:space="preserve">Vistas web diferenciadas por rol (Administrador, Propietario, Guardia).</w:t>
+      </w:r>
+    </w:p>
+    <w:p>
+      <w:pPr>
+        <w:pStyle w:val="Prrafodelista"/>
+        <w:numPr>
+          <w:ilvl w:val="0"/>
+          <w:numId w:val="4"/>
+        </w:numPr>
+      </w:pPr>
+      <w:r>
+        <w:t xml:space="preserve">Registro histórico de accesos (RegistroAcceso) y auditoría.</w:t>
+      </w:r>
+    </w:p>
+    <w:p>
+      <w:pPr>
+        <w:pStyle w:val="Prrafodelista"/>
+        <w:numPr>
+          <w:ilvl w:val="0"/>
+          <w:numId w:val="4"/>
+        </w:numPr>
+      </w:pPr>
+      <w:r>
+        <w:t xml:space="preserve">Almacenamiento de las imágenes capturadas en Cloudinary, guardando en la base de datos solo su URL, con eliminación automática a los 60 días.</w:t>
+      </w:r>
+    </w:p>
+    <w:p>
+      <w:pPr>
+        <w:pStyle w:val="Prrafodelista"/>
+        <w:numPr>
+          <w:ilvl w:val="0"/>
+          <w:numId w:val="4"/>
+        </w:numPr>
+      </w:pPr>
+      <w:r>
+        <w:t xml:space="preserve">Despliegue en entorno de pruebas: backend y base de datos en Render, y frontend en Netlify, en sus planes gratuitos.</w:t>
+      </w:r>
+    </w:p>
+    <w:p>
+      <w:pPr>
+        <w:pStyle w:val="Prrafodelista"/>
+        <w:numPr>
+          <w:ilvl w:val="0"/>
+          <w:numId w:val="4"/>
+        </w:numPr>
+      </w:pPr>
+      <w:r>
+        <w:t xml:space="preserve">Seguimiento de sprints e historias de usuario en Jira, con retrospectiva al cierre de cada sprint.</w:t>
+      </w:r>
+    </w:p>
+    <w:p>
+      <w:pPr>
+        <w:pStyle w:val="Prrafodelista"/>
+        <w:numPr>
+          <w:ilvl w:val="0"/>
+          <w:numId w:val="4"/>
+        </w:numPr>
+      </w:pPr>
+      <w:r>
+        <w:t xml:space="preserve">Pruebas en terreno acotadas a 2 o 3 vehículos autorizados con consentimiento explícito.</w:t>
+      </w:r>
+    </w:p>
+    <w:p>
+      <w:pPr>
+        <w:pStyle w:val="Ttulo3"/>
+        <w:rPr>
+          <w:i/>
+          <w:iCs/>
+        </w:rPr>
+      </w:pPr>
+      <w:bookmarkStart w:id="10" w:name="_Toc241363081"/>
+      <w:r>
+        <w:rPr>
+          <w:i/>
+          <w:iCs/>
+        </w:rPr>
+        <w:t>Fuera del Alcance (Exclusiones)</w:t>
+      </w:r>
+      <w:bookmarkEnd w:id="10"/>
+    </w:p>
+    <w:p>
+      <w:pPr>
+        <w:pStyle w:val="Prrafodelista"/>
+        <w:numPr>
+          <w:ilvl w:val="0"/>
+          <w:numId w:val="4"/>
+        </w:numPr>
+      </w:pPr>
+      <w:r>
+        <w:t xml:space="preserve">Control físico o automatización de barreras/portones de acceso (la apertura permanece a criterio/operación del Guardia).</w:t>
+      </w:r>
+    </w:p>
+    <w:p>
+      <w:pPr>
+        <w:pStyle w:val="Prrafodelista"/>
+        <w:numPr>
+          <w:ilvl w:val="0"/>
+          <w:numId w:val="4"/>
+        </w:numPr>
+      </w:pPr>
+      <w:r>
+        <w:t xml:space="preserve">Uso de cámaras LPR comerciales especializadas.</w:t>
+      </w:r>
+    </w:p>
+    <w:p>
+      <w:pPr>
+        <w:pStyle w:val="Prrafodelista"/>
+        <w:numPr>
+          <w:ilvl w:val="0"/>
+          <w:numId w:val="4"/>
+        </w:numPr>
+      </w:pPr>
+      <w:r>
+        <w:t xml:space="preserve">Recolección o almacenamiento masivo de patentes de terceros sin consentimiento.</w:t>
+      </w:r>
+    </w:p>
+    <w:p>
+      <w:pPr>
+        <w:pStyle w:val="Prrafodelista"/>
+        <w:numPr>
+          <w:ilvl w:val="0"/>
+          <w:numId w:val="4"/>
+        </w:numPr>
+      </w:pPr>
+      <w:r>
+        <w:t xml:space="preserve">Adquisición de hardware adicional de alto costo o licencias de software pagadas.</w:t>
+      </w:r>
+    </w:p>
+    <w:p>
+      <w:pPr>
+        <w:pStyle w:val="Prrafodelista"/>
+        <w:numPr>
+          <w:ilvl w:val="0"/>
+          <w:numId w:val="4"/>
+        </w:numPr>
+      </w:pPr>
+      <w:r>
+        <w:t xml:space="preserve">Contratación de planes pagados de alojamiento durante el proyecto; en una operación real, su costo es asumido por el cliente.</w:t>
+      </w:r>
+    </w:p>
+    <w:p>
+      <w:pPr>
+        <w:pStyle w:val="Ttulo2"/>
+        <w:pBdr>
+          <w:bottom w:val="single" w:sz="4" w:space="1" w:color="000000"/>
+        </w:pBdr>
+        <w:spacing w:after="240"/>
       </w:pPr>
       <w:r>
         <w:rPr>
@@ -1811,9 +1579,8 @@
         </w:rPr>
         <w:br/>
       </w:r>
-    </w:p>
-    <w:p>
-      <w:pPr>
+      <w:bookmarkStart w:id="11" w:name="_Toc241363082"/>
+      <w:r>
         <w:rPr>
           <w:b/>
           <w:bCs/>
@@ -1823,43 +1590,87 @@
           <w:sz w:val="32"/>
           <w:szCs w:val="32"/>
         </w:rPr>
-      </w:pPr>
-      <w:r>
-        <w:rPr>
-          <w:b/>
-          <w:bCs/>
+        <w:t>Restricciones, Supuestos y Riesgos</w:t>
+      </w:r>
+      <w:bookmarkEnd w:id="11"/>
+    </w:p>
+    <w:p>
+      <w:pPr>
+        <w:pStyle w:val="Ttulo3"/>
+        <w:rPr>
           <w:i/>
           <w:iCs/>
-          <w:color w:val="000000"/>
-          <w:sz w:val="32"/>
-          <w:szCs w:val="32"/>
-        </w:rPr>
-        <w:br w:type="page"/>
-      </w:r>
-    </w:p>
-    <w:p>
-      <w:pPr>
-        <w:pStyle w:val="Ttulo2"/>
-        <w:pBdr>
-          <w:bottom w:val="single" w:sz="4" w:space="1" w:color="000000"/>
-        </w:pBdr>
-        <w:spacing w:after="240"/>
-      </w:pPr>
-      <w:bookmarkStart w:id="8" w:name="_Toc241363079"/>
-      <w:r>
-        <w:rPr>
-          <w:b/>
-          <w:bCs/>
+        </w:rPr>
+      </w:pPr>
+      <w:bookmarkStart w:id="12" w:name="_Toc241363083"/>
+      <w:r>
+        <w:rPr>
           <w:i/>
           <w:iCs/>
-          <w:color w:val="000000"/>
-          <w:sz w:val="32"/>
-          <w:szCs w:val="32"/>
-        </w:rPr>
-        <w:lastRenderedPageBreak/>
-        <w:t>Alcance y Exclusiones</w:t>
-      </w:r>
-      <w:bookmarkEnd w:id="8"/>
+        </w:rPr>
+        <w:t>Restricciones</w:t>
+      </w:r>
+      <w:bookmarkEnd w:id="12"/>
+    </w:p>
+    <w:p>
+      <w:pPr>
+        <w:pStyle w:val="Prrafodelista"/>
+        <w:numPr>
+          <w:ilvl w:val="0"/>
+          <w:numId w:val="4"/>
+        </w:numPr>
+      </w:pPr>
+      <w:r>
+        <w:t xml:space="preserve">Protección de datos: Resguardo de los datos personales y la privacidad de los usuarios y de los terceros cuyas patentes sean capturadas.</w:t>
+      </w:r>
+    </w:p>
+    <w:p>
+      <w:pPr>
+        <w:pStyle w:val="Prrafodelista"/>
+        <w:numPr>
+          <w:ilvl w:val="0"/>
+          <w:numId w:val="4"/>
+        </w:numPr>
+      </w:pPr>
+      <w:r>
+        <w:t xml:space="preserve">Temporal: 18 semanas del periodo académico (Fase 1: Semanas 1-4, planificación; Fase 2: Semanas 5-15, Sprints 0 a 5; Fase 3: Semanas 16-18, presentación final).</w:t>
+      </w:r>
+    </w:p>
+    <w:p>
+      <w:pPr>
+        <w:pStyle w:val="Prrafodelista"/>
+        <w:numPr>
+          <w:ilvl w:val="0"/>
+          <w:numId w:val="4"/>
+        </w:numPr>
+      </w:pPr>
+      <w:r>
+        <w:t xml:space="preserve">Económica/Hardware: Presupuesto acotado a hardware de bajo costo (cámara IP TP-Link Tapo C310 y Raspberry Pi 4 de 4GB) y a los planes gratuitos de Render, Netlify y Cloudinary.</w:t>
+      </w:r>
+    </w:p>
+    <w:p>
+      <w:pPr>
+        <w:pStyle w:val="Prrafodelista"/>
+        <w:numPr>
+          <w:ilvl w:val="0"/>
+          <w:numId w:val="4"/>
+        </w:numPr>
+      </w:pPr>
+      <w:r>
+        <w:t xml:space="preserve">Tecnológica: Servicio web desarrollado en JavaScript con Node.js, Express.js y Socket.io, sobre PostgreSQL; el pipeline de reconocimiento de la Raspberry Pi es independiente del servicio web.</w:t>
+      </w:r>
+    </w:p>
+    <w:p>
+      <w:pPr>
+        <w:pStyle w:val="Prrafodelista"/>
+        <w:numPr>
+          <w:ilvl w:val="0"/>
+          <w:numId w:val="4"/>
+        </w:numPr>
+      </w:pPr>
+      <w:r>
+        <w:t xml:space="preserve">Dedicación: 10 a 15 horas semanales combinadas de trabajo fuera de aula.</w:t>
+      </w:r>
     </w:p>
     <w:p>
       <w:pPr>
@@ -1869,110 +1680,74 @@
           <w:iCs/>
         </w:rPr>
       </w:pPr>
-      <w:bookmarkStart w:id="9" w:name="_Toc241363080"/>
+      <w:bookmarkStart w:id="13" w:name="_Toc241363084"/>
       <w:r>
         <w:rPr>
           <w:i/>
           <w:iCs/>
         </w:rPr>
-        <w:t>Dentro del Alcance (Inclusiones)</w:t>
-      </w:r>
-      <w:bookmarkEnd w:id="9"/>
-    </w:p>
-    <w:p>
-      <w:pPr>
-        <w:pStyle w:val="Prrafodelista"/>
-        <w:numPr>
-          <w:ilvl w:val="0"/>
-          <w:numId w:val="4"/>
-        </w:numPr>
-      </w:pPr>
-      <w:r>
-        <w:t>Arquitectura multi-tenant aislada por recinto (condominio/edificio).</w:t>
-      </w:r>
-    </w:p>
-    <w:p>
-      <w:pPr>
-        <w:pStyle w:val="Prrafodelista"/>
-        <w:numPr>
-          <w:ilvl w:val="0"/>
-          <w:numId w:val="4"/>
-        </w:numPr>
-      </w:pPr>
-      <w:r>
-        <w:t>Carga y gestión de vehículos autorizados por el Administrador.</w:t>
-      </w:r>
-    </w:p>
-    <w:p>
-      <w:pPr>
-        <w:pStyle w:val="Prrafodelista"/>
-        <w:numPr>
-          <w:ilvl w:val="0"/>
-          <w:numId w:val="4"/>
-        </w:numPr>
-      </w:pPr>
-      <w:r>
-        <w:t>Registro de visitas por el Propietario con vigencia de 24 horas.</w:t>
-      </w:r>
-    </w:p>
-    <w:p>
-      <w:pPr>
-        <w:pStyle w:val="Prrafodelista"/>
-        <w:numPr>
-          <w:ilvl w:val="0"/>
-          <w:numId w:val="4"/>
-        </w:numPr>
-      </w:pPr>
-      <w:r>
-        <w:t>Pipeline LPR: Detección de patente (YOLO fine-tuned), OCR y validación de formato chileno.</w:t>
-      </w:r>
-    </w:p>
-    <w:p>
-      <w:pPr>
-        <w:pStyle w:val="Prrafodelista"/>
-        <w:numPr>
-          <w:ilvl w:val="0"/>
-          <w:numId w:val="4"/>
-        </w:numPr>
-      </w:pPr>
-      <w:r>
-        <w:t>Validación contra base de datos y sistema de alertas en tiempo real (WebSocket) para el Guardia.</w:t>
-      </w:r>
-    </w:p>
-    <w:p>
-      <w:pPr>
-        <w:pStyle w:val="Prrafodelista"/>
-        <w:numPr>
-          <w:ilvl w:val="0"/>
-          <w:numId w:val="4"/>
-        </w:numPr>
-      </w:pPr>
-      <w:r>
-        <w:t>Vistas webs diferenciadas por rol (Administrador, Propietario, Guardia).</w:t>
-      </w:r>
-    </w:p>
-    <w:p>
-      <w:pPr>
-        <w:pStyle w:val="Prrafodelista"/>
-        <w:numPr>
-          <w:ilvl w:val="0"/>
-          <w:numId w:val="4"/>
-        </w:numPr>
-      </w:pPr>
-      <w:r>
-        <w:t>Registro histórico de accesos (RegistroAcceso) y auditoría.</w:t>
-      </w:r>
-    </w:p>
-    <w:p>
-      <w:pPr>
-        <w:pStyle w:val="Prrafodelista"/>
-        <w:numPr>
-          <w:ilvl w:val="0"/>
-          <w:numId w:val="4"/>
-        </w:numPr>
-      </w:pPr>
-      <w:r>
-        <w:t>Pruebas en terreno acotadas a 2 o 3 vehículos autorizados con consentimiento explícito.</w:t>
+        <w:t>Supuestos</w:t>
+      </w:r>
+      <w:bookmarkEnd w:id="13"/>
+    </w:p>
+    <w:p>
+      <w:pPr>
+        <w:pStyle w:val="Prrafodelista"/>
+        <w:numPr>
+          <w:ilvl w:val="0"/>
+          <w:numId w:val="4"/>
+        </w:numPr>
+      </w:pPr>
+      <w:r>
+        <w:t xml:space="preserve">Dataset público bajo licencia CC BY 4.0 es representativo para el entrenamiento del modelo.</w:t>
+      </w:r>
+    </w:p>
+    <w:p>
+      <w:pPr>
+        <w:pStyle w:val="Prrafodelista"/>
+        <w:numPr>
+          <w:ilvl w:val="0"/>
+          <w:numId w:val="4"/>
+        </w:numPr>
+      </w:pPr>
+      <w:r>
+        <w:t xml:space="preserve">El ajuste fino (fine-tuning) sobre YOLOv8 reduce el tiempo y costo computacional frente a un entrenamiento desde cero.</w:t>
+      </w:r>
+    </w:p>
+    <w:p>
+      <w:pPr>
+        <w:pStyle w:val="Prrafodelista"/>
+        <w:numPr>
+          <w:ilvl w:val="0"/>
+          <w:numId w:val="4"/>
+        </w:numPr>
+      </w:pPr>
+      <w:r>
+        <w:t xml:space="preserve">Existe conectividad de red local entre la cámara IP y la Raspberry Pi, y conexión a Internet entre la Raspberry Pi y el backend para sincronizar la copia local y enviar los resultados.</w:t>
+      </w:r>
+    </w:p>
+    <w:p>
+      <w:pPr>
+        <w:pStyle w:val="Prrafodelista"/>
+        <w:numPr>
+          <w:ilvl w:val="0"/>
+          <w:numId w:val="4"/>
+        </w:numPr>
+      </w:pPr>
+      <w:r>
+        <w:t xml:space="preserve">El modelo de datos (MER) es estable y permite el desarrollo paralelo.</w:t>
+      </w:r>
+    </w:p>
+    <w:p>
+      <w:pPr>
+        <w:pStyle w:val="Prrafodelista"/>
+        <w:numPr>
+          <w:ilvl w:val="0"/>
+          <w:numId w:val="4"/>
+        </w:numPr>
+      </w:pPr>
+      <w:r>
+        <w:t xml:space="preserve">Las limitaciones de los planes gratuitos de alojamiento (suspensión por inactividad y tiempo de reactivación) son aceptables en el entorno de pruebas.</w:t>
       </w:r>
     </w:p>
     <w:p>
@@ -1983,229 +1758,62 @@
           <w:iCs/>
         </w:rPr>
       </w:pPr>
-      <w:bookmarkStart w:id="10" w:name="_Toc241363081"/>
+      <w:bookmarkStart w:id="901" w:name="_Toc241363099"/>
       <w:r>
         <w:rPr>
           <w:i/>
           <w:iCs/>
         </w:rPr>
-        <w:t>Fuera del Alcance (Exclusiones)</w:t>
-      </w:r>
-      <w:bookmarkEnd w:id="10"/>
-    </w:p>
-    <w:p>
-      <w:pPr>
-        <w:pStyle w:val="Prrafodelista"/>
-        <w:numPr>
-          <w:ilvl w:val="0"/>
-          <w:numId w:val="4"/>
-        </w:numPr>
-      </w:pPr>
-      <w:r>
-        <w:t>Control físico o automatización de barreras/portones de acceso (la apertura permanece a criterio/operación del Guardia).</w:t>
-      </w:r>
-    </w:p>
-    <w:p>
-      <w:pPr>
-        <w:pStyle w:val="Prrafodelista"/>
-        <w:numPr>
-          <w:ilvl w:val="0"/>
-          <w:numId w:val="4"/>
-        </w:numPr>
-      </w:pPr>
-      <w:r>
-        <w:t>Uso de cámaras LPR comerciales especializadas.</w:t>
-      </w:r>
-    </w:p>
-    <w:p>
-      <w:pPr>
-        <w:pStyle w:val="Prrafodelista"/>
-        <w:numPr>
-          <w:ilvl w:val="0"/>
-          <w:numId w:val="4"/>
-        </w:numPr>
-      </w:pPr>
-      <w:r>
-        <w:t>Recolección o almacenamiento masivo de patentes de terceros sin consentimiento (Ley N° 19.628).</w:t>
-      </w:r>
-    </w:p>
-    <w:p>
-      <w:pPr>
-        <w:pStyle w:val="Prrafodelista"/>
-        <w:numPr>
-          <w:ilvl w:val="0"/>
-          <w:numId w:val="4"/>
-        </w:numPr>
-      </w:pPr>
-      <w:r>
-        <w:t>Adquisición de hardware adicional de alto costo o licencias de software pagadas.</w:t>
-      </w:r>
-    </w:p>
-    <w:p>
-      <w:pPr>
-        <w:pStyle w:val="Ttulo2"/>
-        <w:pBdr>
-          <w:bottom w:val="single" w:sz="4" w:space="1" w:color="000000"/>
-        </w:pBdr>
-        <w:spacing w:after="240"/>
-      </w:pPr>
-      <w:r>
-        <w:rPr>
-          <w:b/>
-          <w:bCs/>
-          <w:i/>
-          <w:iCs/>
-          <w:color w:val="000000"/>
-          <w:sz w:val="24"/>
-          <w:szCs w:val="24"/>
-        </w:rPr>
-        <w:br/>
-      </w:r>
-      <w:bookmarkStart w:id="11" w:name="_Toc241363082"/>
-      <w:r>
-        <w:rPr>
-          <w:b/>
-          <w:bCs/>
-          <w:i/>
-          <w:iCs/>
-          <w:color w:val="000000"/>
-          <w:sz w:val="32"/>
-          <w:szCs w:val="32"/>
-        </w:rPr>
-        <w:t>Restricciones, Supuestos y Riesgos</w:t>
-      </w:r>
-      <w:bookmarkEnd w:id="11"/>
-    </w:p>
-    <w:p>
-      <w:pPr>
-        <w:pStyle w:val="Ttulo3"/>
-        <w:rPr>
-          <w:i/>
-          <w:iCs/>
-        </w:rPr>
-      </w:pPr>
-      <w:bookmarkStart w:id="12" w:name="_Toc241363083"/>
-      <w:r>
-        <w:rPr>
-          <w:i/>
-          <w:iCs/>
-        </w:rPr>
-        <w:t>Restricciones</w:t>
-      </w:r>
-      <w:bookmarkEnd w:id="12"/>
-    </w:p>
-    <w:p>
-      <w:pPr>
-        <w:pStyle w:val="Prrafodelista"/>
-        <w:numPr>
-          <w:ilvl w:val="0"/>
-          <w:numId w:val="4"/>
-        </w:numPr>
-      </w:pPr>
-      <w:r>
-        <w:t>Legal: Cumplimiento de la Ley N° 19.628 sobre protección de datos personales.</w:t>
-      </w:r>
-    </w:p>
-    <w:p>
-      <w:pPr>
-        <w:pStyle w:val="Prrafodelista"/>
-        <w:numPr>
-          <w:ilvl w:val="0"/>
-          <w:numId w:val="4"/>
-        </w:numPr>
-      </w:pPr>
-      <w:r>
-        <w:t>Temporal: 18 semanas del periodo académico (Fase 1: Semanas 1-4, Fase 2: Semanas 5-15, Fase 3: Semanas 16-18).</w:t>
-      </w:r>
-    </w:p>
-    <w:p>
-      <w:pPr>
-        <w:pStyle w:val="Prrafodelista"/>
-        <w:numPr>
-          <w:ilvl w:val="0"/>
-          <w:numId w:val="4"/>
-        </w:numPr>
-      </w:pPr>
-      <w:r>
-        <w:t>Económica/Hardware: Presupuesto acotado a hardware de bajo costo (cámara IP TP-Link Tapo C310 y Raspberry Pi 4 de 4GB).</w:t>
-      </w:r>
-    </w:p>
-    <w:p>
-      <w:pPr>
-        <w:pStyle w:val="Prrafodelista"/>
-        <w:numPr>
-          <w:ilvl w:val="0"/>
-          <w:numId w:val="4"/>
-        </w:numPr>
-      </w:pPr>
-      <w:r>
-        <w:t>Dedicación: 10 a 15 horas semanales combinadas de trabajo fuera de aula.</w:t>
-      </w:r>
-    </w:p>
-    <w:p>
-      <w:pPr>
-        <w:pStyle w:val="Ttulo3"/>
-        <w:rPr>
-          <w:i/>
-          <w:iCs/>
-        </w:rPr>
-      </w:pPr>
-      <w:bookmarkStart w:id="13" w:name="_Toc241363084"/>
-      <w:r>
-        <w:rPr>
-          <w:i/>
-          <w:iCs/>
-        </w:rPr>
-        <w:t>Supuestos</w:t>
-      </w:r>
-      <w:bookmarkEnd w:id="13"/>
-    </w:p>
-    <w:p>
-      <w:pPr>
-        <w:pStyle w:val="Prrafodelista"/>
-        <w:numPr>
-          <w:ilvl w:val="0"/>
-          <w:numId w:val="4"/>
-        </w:numPr>
-      </w:pPr>
-      <w:r>
-        <w:t>Dataset público bajo licencia CC BY 4.0 es representativo para el entrenamiento del modelo.</w:t>
-      </w:r>
-    </w:p>
-    <w:p>
-      <w:pPr>
-        <w:pStyle w:val="Prrafodelista"/>
-        <w:numPr>
-          <w:ilvl w:val="0"/>
-          <w:numId w:val="4"/>
-        </w:numPr>
-      </w:pPr>
-      <w:r>
-        <w:t>El ajuste fino (fine-tuning) sobre YOLOv8 reduce el tiempo y costo computacional frente a un entrenamiento desde cero.</w:t>
-      </w:r>
-    </w:p>
-    <w:p>
-      <w:pPr>
-        <w:pStyle w:val="Prrafodelista"/>
-        <w:numPr>
-          <w:ilvl w:val="0"/>
-          <w:numId w:val="4"/>
-        </w:numPr>
-      </w:pPr>
-      <w:r>
-        <w:t>Existe conectividad estable de red local entre la cámara IP, Raspberry Pi y el backend.</w:t>
-      </w:r>
-    </w:p>
-    <w:p>
-      <w:pPr>
-        <w:pStyle w:val="Prrafodelista"/>
-        <w:numPr>
-          <w:ilvl w:val="0"/>
-          <w:numId w:val="4"/>
-        </w:numPr>
-      </w:pPr>
-      <w:r>
-        <w:t>El modelo de datos (MER) es estable y permite el desarrollo paralelo.</w:t>
+        <w:t xml:space="preserve">Riesgos</w:t>
+      </w:r>
+      <w:bookmarkEnd w:id="901"/>
+    </w:p>
+    <w:p>
+      <w:pPr>
+        <w:pStyle w:val="Prrafodelista"/>
+        <w:numPr>
+          <w:ilvl w:val="0"/>
+          <w:numId w:val="4"/>
+        </w:numPr>
+      </w:pPr>
+      <w:r>
+        <w:t xml:space="preserve">Desempeño del reconocimiento: la detección y lectura de patentes puede variar según la iluminación y el ángulo de cámara. Mitigación: calibración del modelo durante las pruebas en terreno (Sprint 5).</w:t>
+      </w:r>
+    </w:p>
+    <w:p>
+      <w:pPr>
+        <w:pStyle w:val="Prrafodelista"/>
+        <w:numPr>
+          <w:ilvl w:val="0"/>
+          <w:numId w:val="4"/>
+        </w:numPr>
+      </w:pPr>
+      <w:r>
+        <w:t xml:space="preserve">Integración de sistemas: la integración del pipeline de la Raspberry Pi con el backend es la etapa de mayor riesgo técnico. Mitigación: desarrollo en paralelo desde los primeros sprints y coordinación continua durante el Sprint 4.</w:t>
+      </w:r>
+    </w:p>
+    <w:p>
+      <w:pPr>
+        <w:pStyle w:val="Prrafodelista"/>
+        <w:numPr>
+          <w:ilvl w:val="0"/>
+          <w:numId w:val="4"/>
+        </w:numPr>
+      </w:pPr>
+      <w:r>
+        <w:t xml:space="preserve">Datos reales limitados: la protección de datos restringe el número de vehículos reales utilizables para las pruebas. Mitigación: entrenamiento con el dataset público y validación con 2 a 3 vehículos con consentimiento explícito.</w:t>
+      </w:r>
+    </w:p>
+    <w:p>
+      <w:pPr>
+        <w:pStyle w:val="Prrafodelista"/>
+        <w:numPr>
+          <w:ilvl w:val="0"/>
+          <w:numId w:val="4"/>
+        </w:numPr>
+      </w:pPr>
+      <w:r>
+        <w:t xml:space="preserve">Planes gratuitos de alojamiento: la suspensión por inactividad retrasa la primera respuesta del sistema. Mitigación: se acepta en el entorno de pruebas; en una operación real, el cliente asume un plan pagado.</w:t>
       </w:r>
     </w:p>
     <w:sectPr>

</xml_diff>